<commit_message>
Mise en cohérence des cas d'usage, des user stories et des maquettes
</commit_message>
<xml_diff>
--- a/livrables/2-user-stories/user-stories-learn-home.docx
+++ b/livrables/2-user-stories/user-stories-learn-home.docx
@@ -115,7 +115,7 @@
           <w:sz w:val="20"/>
           <w:szCs w:val="20"/>
         </w:rPr>
-        <w:t xml:space="preserve">enfant inscrit, suivi par un tuteur bénévole.</w:t>
+        <w:t xml:space="preserve">enfant inscrit, suivi par un tuteur bénévole. Les notes disent aussi « étudiant ».</w:t>
       </w:r>
     </w:p>
     <w:p>
@@ -143,7 +143,7 @@
           <w:sz w:val="20"/>
           <w:szCs w:val="20"/>
         </w:rPr>
-        <w:t xml:space="preserve">tuteur qui accompagne un ou plusieurs élèves.</w:t>
+        <w:t xml:space="preserve">tuteur qui accompagne un ou plusieurs élèves. Les notes disent aussi « tuteur ».</w:t>
       </w:r>
     </w:p>
     <w:p>
@@ -549,15 +549,15 @@
                 <w:sz w:val="20"/>
                 <w:szCs w:val="20"/>
               </w:rPr>
-              <w:t xml:space="preserve">En tant que </w:t>
-            </w:r>
-            <w:r>
-              <w:rPr>
-                <w:rFonts w:ascii="Arial" w:cs="Arial" w:eastAsia="Arial" w:hAnsi="Arial"/>
-                <w:sz w:val="20"/>
-                <w:szCs w:val="20"/>
-              </w:rPr>
-              <w:t xml:space="preserve">visiteur non connecté</w:t>
+              <w:t xml:space="preserve">En tant qu'</w:t>
+            </w:r>
+            <w:r>
+              <w:rPr>
+                <w:rFonts w:ascii="Arial" w:cs="Arial" w:eastAsia="Arial" w:hAnsi="Arial"/>
+                <w:sz w:val="20"/>
+                <w:szCs w:val="20"/>
+              </w:rPr>
+              <w:t xml:space="preserve">élève ou bénévole</w:t>
             </w:r>
           </w:p>
           <w:p>
@@ -577,7 +577,7 @@
                 <w:sz w:val="20"/>
                 <w:szCs w:val="20"/>
               </w:rPr>
-              <w:t xml:space="preserve">être renvoyé vers la connexion si j'ouvre une autre page</w:t>
+              <w:t xml:space="preserve">que les pages du site soient réservées aux utilisateurs connectés</w:t>
             </w:r>
           </w:p>
           <w:p>
@@ -597,7 +597,7 @@
                 <w:sz w:val="20"/>
                 <w:szCs w:val="20"/>
               </w:rPr>
-              <w:t xml:space="preserve">que les données des élèves et des bénévoles restent privées</w:t>
+              <w:t xml:space="preserve">que mes données restent privées</w:t>
             </w:r>
           </w:p>
         </w:tc>
@@ -907,15 +907,15 @@
                 <w:sz w:val="20"/>
                 <w:szCs w:val="20"/>
               </w:rPr>
-              <w:t xml:space="preserve">En tant que </w:t>
-            </w:r>
-            <w:r>
-              <w:rPr>
-                <w:rFonts w:ascii="Arial" w:cs="Arial" w:eastAsia="Arial" w:hAnsi="Arial"/>
-                <w:sz w:val="20"/>
-                <w:szCs w:val="20"/>
-              </w:rPr>
-              <w:t xml:space="preserve">nouvel utilisateur</w:t>
+              <w:t xml:space="preserve">En tant qu'</w:t>
+            </w:r>
+            <w:r>
+              <w:rPr>
+                <w:rFonts w:ascii="Arial" w:cs="Arial" w:eastAsia="Arial" w:hAnsi="Arial"/>
+                <w:sz w:val="20"/>
+                <w:szCs w:val="20"/>
+              </w:rPr>
+              <w:t xml:space="preserve">élève ou bénévole</w:t>
             </w:r>
           </w:p>
           <w:p>
@@ -955,7 +955,7 @@
                 <w:sz w:val="20"/>
                 <w:szCs w:val="20"/>
               </w:rPr>
-              <w:t xml:space="preserve">m'inscrire sur le site</w:t>
+              <w:t xml:space="preserve">m'inscrire si je n'ai pas encore de compte</w:t>
             </w:r>
           </w:p>
         </w:tc>
@@ -1288,7 +1288,7 @@
                 <w:sz w:val="20"/>
                 <w:szCs w:val="20"/>
               </w:rPr>
-              <w:t xml:space="preserve">Un champ « Votre texte ici » et un bouton d'envoi sont placés sous la conversation.</w:t>
+              <w:t xml:space="preserve">Un champ « Ton texte ici » et un bouton d'envoi sont placés sous la conversation.</w:t>
             </w:r>
           </w:p>
           <w:p>
@@ -1808,7 +1808,24 @@
                 <w:sz w:val="20"/>
                 <w:szCs w:val="20"/>
               </w:rPr>
-              <w:t xml:space="preserve">Une fenêtre me permet de choisir la personne à ajouter.</w:t>
+              <w:t xml:space="preserve">Une fenêtre me permet de rechercher et de choisir la personne à ajouter.</w:t>
+            </w:r>
+          </w:p>
+          <w:p>
+            <w:pPr>
+              <w:pStyle w:val="ListParagraph"/>
+              <w:numPr>
+                <w:ilvl w:val="0"/>
+                <w:numId w:val="2"/>
+              </w:numPr>
+            </w:pPr>
+            <w:r>
+              <w:rPr>
+                <w:rFonts w:ascii="Arial" w:cs="Arial" w:eastAsia="Arial" w:hAnsi="Arial"/>
+                <w:sz w:val="20"/>
+                <w:szCs w:val="20"/>
+              </w:rPr>
+              <w:t xml:space="preserve">Les personnes déjà présentes dans ma liste ne sont pas proposées.</w:t>
             </w:r>
           </w:p>
           <w:p>
@@ -1970,7 +1987,7 @@
                 <w:sz w:val="20"/>
                 <w:szCs w:val="20"/>
               </w:rPr>
-              <w:t xml:space="preserve">Chaque contact propose une action « Supprimer ».</w:t>
+              <w:t xml:space="preserve">La conversation ouverte propose une action « Supprimer le contact ».</w:t>
             </w:r>
           </w:p>
           <w:p>
@@ -2514,7 +2531,7 @@
           <w:sz w:val="20"/>
           <w:szCs w:val="20"/>
         </w:rPr>
-        <w:t xml:space="preserve">Calendrier classique qui affiche les événements et les rendez-vous de l'utilisateur.</w:t>
+        <w:t xml:space="preserve">Calendrier classique qui affiche les événements et les rendez-vous de l'utilisateur. Les notes ne disent pas qui les crée : point à confirmer (question 1).</w:t>
       </w:r>
     </w:p>
     <w:tbl>
@@ -3154,7 +3171,7 @@
           <w:sz w:val="20"/>
           <w:szCs w:val="20"/>
         </w:rPr>
-        <w:t xml:space="preserve">L'élève crée des tâches pour lui-même. Le bénévole crée des tâches pour les élèves qu'il suit.</w:t>
+        <w:t xml:space="preserve">L'élève crée des tâches pour lui-même. Le bénévole crée des tâches pour les élèves qu'il suit. Chacun ne supprime que les tâches qu'il a créées : règle à confirmer (question 3).</w:t>
       </w:r>
     </w:p>
     <w:tbl>
@@ -4074,7 +4091,7 @@
                 <w:sz w:val="20"/>
                 <w:szCs w:val="20"/>
               </w:rPr>
-              <w:t xml:space="preserve">supprimer une tâche</w:t>
+              <w:t xml:space="preserve">supprimer une tâche que j'ai créée</w:t>
             </w:r>
           </w:p>
           <w:p>
@@ -4128,7 +4145,7 @@
                 <w:sz w:val="20"/>
                 <w:szCs w:val="20"/>
               </w:rPr>
-              <w:t xml:space="preserve">Chaque tâche propose une action « Supprimer ».</w:t>
+              <w:t xml:space="preserve">Seules les tâches que j'ai créées proposent une action « Supprimer ».</w:t>
             </w:r>
           </w:p>
           <w:p>
@@ -5022,7 +5039,7 @@
           <w:sz w:val="20"/>
           <w:szCs w:val="20"/>
         </w:rPr>
-        <w:t xml:space="preserve">Les notes demandent d'afficher le calendrier. Faut-il aussi pouvoir ajouter ou supprimer un événement ?</w:t>
+        <w:t xml:space="preserve">Les notes demandent d'afficher le calendrier. Qui crée les événements et les rendez-vous ? Faut-il pouvoir en ajouter ou en supprimer depuis le site ?</w:t>
       </w:r>
     </w:p>
     <w:p>
@@ -5056,7 +5073,7 @@
           <w:sz w:val="20"/>
           <w:szCs w:val="20"/>
         </w:rPr>
-        <w:t xml:space="preserve">Qui peut supprimer une tâche créée par le bénévole pour un élève ?</w:t>
+        <w:t xml:space="preserve">Le cadrage prévoit que chacun ne supprime que les tâches qu'il a créées. Un élève peut-il supprimer une tâche ajoutée par son tuteur ?</w:t>
       </w:r>
     </w:p>
     <w:p>
@@ -5074,6 +5091,40 @@
           <w:szCs w:val="20"/>
         </w:rPr>
         <w:t xml:space="preserve">Qui assigne un tuteur à un élève ?</w:t>
+      </w:r>
+    </w:p>
+    <w:p>
+      <w:pPr>
+        <w:pStyle w:val="ListParagraph"/>
+        <w:numPr>
+          <w:ilvl w:val="0"/>
+          <w:numId w:val="3"/>
+        </w:numPr>
+      </w:pPr>
+      <w:r>
+        <w:rPr>
+          <w:rFonts w:ascii="Arial" w:cs="Arial" w:eastAsia="Arial" w:hAnsi="Arial"/>
+          <w:sz w:val="20"/>
+          <w:szCs w:val="20"/>
+        </w:rPr>
+        <w:t xml:space="preserve">Qui peut-on ajouter comme contact dans le chat : seulement son tuteur ou ses élèves, ou tout membre de l'association ?</w:t>
+      </w:r>
+    </w:p>
+    <w:p>
+      <w:pPr>
+        <w:pStyle w:val="ListParagraph"/>
+        <w:numPr>
+          <w:ilvl w:val="0"/>
+          <w:numId w:val="3"/>
+        </w:numPr>
+      </w:pPr>
+      <w:r>
+        <w:rPr>
+          <w:rFonts w:ascii="Arial" w:cs="Arial" w:eastAsia="Arial" w:hAnsi="Arial"/>
+          <w:sz w:val="20"/>
+          <w:szCs w:val="20"/>
+        </w:rPr>
+        <w:t xml:space="preserve">Que demande la création de compte, et qui peut créer un compte ?</w:t>
       </w:r>
     </w:p>
     <w:sectPr>

</xml_diff>

<commit_message>
Ajout de la déconnexion dans les cas d'usage, les user stories et la navigation
</commit_message>
<xml_diff>
--- a/livrables/2-user-stories/user-stories-learn-home.docx
+++ b/livrables/2-user-stories/user-stories-learn-home.docx
@@ -177,7 +177,7 @@
           <w:sz w:val="20"/>
           <w:szCs w:val="20"/>
         </w:rPr>
-        <w:t xml:space="preserve">Seule page accessible sans compte. Elle mène à la récupération du mot de passe et à la création de compte.</w:t>
+        <w:t xml:space="preserve">Seule page accessible sans compte. Elle mène à la récupération du mot de passe et à la création de compte. La déconnexion y ramène.</w:t>
       </w:r>
     </w:p>
     <w:tbl>
@@ -1007,6 +1007,185 @@
                 <w:szCs w:val="20"/>
               </w:rPr>
               <w:t xml:space="preserve">Le clic sur ce lien ouvre le parcours de création de compte.</w:t>
+            </w:r>
+          </w:p>
+        </w:tc>
+      </w:tr>
+      <w:tr>
+        <w:trPr>
+          <w:cantSplit/>
+        </w:trPr>
+        <w:tc>
+          <w:tcPr>
+            <w:tcW w:type="dxa" w:w="900"/>
+            <w:tcBorders>
+              <w:top w:val="single" w:color="C9CED6" w:sz="4"/>
+              <w:left w:val="single" w:color="C9CED6" w:sz="4"/>
+              <w:bottom w:val="single" w:color="C9CED6" w:sz="4"/>
+              <w:right w:val="single" w:color="C9CED6" w:sz="4"/>
+            </w:tcBorders>
+            <w:tcMar>
+              <w:top w:type="dxa" w:w="100"/>
+              <w:left w:type="dxa" w:w="120"/>
+              <w:bottom w:type="dxa" w:w="100"/>
+              <w:right w:type="dxa" w:w="120"/>
+            </w:tcMar>
+          </w:tcPr>
+          <w:p>
+            <w:r>
+              <w:rPr>
+                <w:rFonts w:ascii="Arial" w:cs="Arial" w:eastAsia="Arial" w:hAnsi="Arial"/>
+                <w:b/>
+                <w:bCs/>
+                <w:sz w:val="20"/>
+                <w:szCs w:val="20"/>
+              </w:rPr>
+              <w:t xml:space="preserve">C5</w:t>
+            </w:r>
+          </w:p>
+        </w:tc>
+        <w:tc>
+          <w:tcPr>
+            <w:tcW w:type="dxa" w:w="4000"/>
+            <w:tcBorders>
+              <w:top w:val="single" w:color="C9CED6" w:sz="4"/>
+              <w:left w:val="single" w:color="C9CED6" w:sz="4"/>
+              <w:bottom w:val="single" w:color="C9CED6" w:sz="4"/>
+              <w:right w:val="single" w:color="C9CED6" w:sz="4"/>
+            </w:tcBorders>
+            <w:tcMar>
+              <w:top w:type="dxa" w:w="100"/>
+              <w:left w:type="dxa" w:w="120"/>
+              <w:bottom w:type="dxa" w:w="100"/>
+              <w:right w:type="dxa" w:w="120"/>
+            </w:tcMar>
+          </w:tcPr>
+          <w:p>
+            <w:r>
+              <w:rPr>
+                <w:rFonts w:ascii="Arial" w:cs="Arial" w:eastAsia="Arial" w:hAnsi="Arial"/>
+                <w:b/>
+                <w:bCs/>
+                <w:sz w:val="20"/>
+                <w:szCs w:val="20"/>
+              </w:rPr>
+              <w:t xml:space="preserve">En tant qu'</w:t>
+            </w:r>
+            <w:r>
+              <w:rPr>
+                <w:rFonts w:ascii="Arial" w:cs="Arial" w:eastAsia="Arial" w:hAnsi="Arial"/>
+                <w:sz w:val="20"/>
+                <w:szCs w:val="20"/>
+              </w:rPr>
+              <w:t xml:space="preserve">élève ou bénévole</w:t>
+            </w:r>
+          </w:p>
+          <w:p>
+            <w:r>
+              <w:rPr>
+                <w:rFonts w:ascii="Arial" w:cs="Arial" w:eastAsia="Arial" w:hAnsi="Arial"/>
+                <w:b/>
+                <w:bCs/>
+                <w:sz w:val="20"/>
+                <w:szCs w:val="20"/>
+              </w:rPr>
+              <w:t xml:space="preserve">je veux </w:t>
+            </w:r>
+            <w:r>
+              <w:rPr>
+                <w:rFonts w:ascii="Arial" w:cs="Arial" w:eastAsia="Arial" w:hAnsi="Arial"/>
+                <w:sz w:val="20"/>
+                <w:szCs w:val="20"/>
+              </w:rPr>
+              <w:t xml:space="preserve">me déconnecter</w:t>
+            </w:r>
+          </w:p>
+          <w:p>
+            <w:r>
+              <w:rPr>
+                <w:rFonts w:ascii="Arial" w:cs="Arial" w:eastAsia="Arial" w:hAnsi="Arial"/>
+                <w:b/>
+                <w:bCs/>
+                <w:sz w:val="20"/>
+                <w:szCs w:val="20"/>
+              </w:rPr>
+              <w:t xml:space="preserve">afin </w:t>
+            </w:r>
+            <w:r>
+              <w:rPr>
+                <w:rFonts w:ascii="Arial" w:cs="Arial" w:eastAsia="Arial" w:hAnsi="Arial"/>
+                <w:sz w:val="20"/>
+                <w:szCs w:val="20"/>
+              </w:rPr>
+              <w:t xml:space="preserve">que personne ne puisse utiliser mon compte après moi</w:t>
+            </w:r>
+          </w:p>
+        </w:tc>
+        <w:tc>
+          <w:tcPr>
+            <w:tcW w:type="dxa" w:w="4126"/>
+            <w:tcBorders>
+              <w:top w:val="single" w:color="C9CED6" w:sz="4"/>
+              <w:left w:val="single" w:color="C9CED6" w:sz="4"/>
+              <w:bottom w:val="single" w:color="C9CED6" w:sz="4"/>
+              <w:right w:val="single" w:color="C9CED6" w:sz="4"/>
+            </w:tcBorders>
+            <w:tcMar>
+              <w:top w:type="dxa" w:w="100"/>
+              <w:left w:type="dxa" w:w="120"/>
+              <w:bottom w:type="dxa" w:w="100"/>
+              <w:right w:type="dxa" w:w="120"/>
+            </w:tcMar>
+          </w:tcPr>
+          <w:p>
+            <w:pPr>
+              <w:pStyle w:val="ListParagraph"/>
+              <w:numPr>
+                <w:ilvl w:val="0"/>
+                <w:numId w:val="2"/>
+              </w:numPr>
+            </w:pPr>
+            <w:r>
+              <w:rPr>
+                <w:rFonts w:ascii="Arial" w:cs="Arial" w:eastAsia="Arial" w:hAnsi="Arial"/>
+                <w:sz w:val="20"/>
+                <w:szCs w:val="20"/>
+              </w:rPr>
+              <w:t xml:space="preserve">Un lien « Se déconnecter » est présent dans le menu (icône en haut à droite sur mobile).</w:t>
+            </w:r>
+          </w:p>
+          <w:p>
+            <w:pPr>
+              <w:pStyle w:val="ListParagraph"/>
+              <w:numPr>
+                <w:ilvl w:val="0"/>
+                <w:numId w:val="2"/>
+              </w:numPr>
+            </w:pPr>
+            <w:r>
+              <w:rPr>
+                <w:rFonts w:ascii="Arial" w:cs="Arial" w:eastAsia="Arial" w:hAnsi="Arial"/>
+                <w:sz w:val="20"/>
+                <w:szCs w:val="20"/>
+              </w:rPr>
+              <w:t xml:space="preserve">Après le clic, j'arrive sur la page de connexion.</w:t>
+            </w:r>
+          </w:p>
+          <w:p>
+            <w:pPr>
+              <w:pStyle w:val="ListParagraph"/>
+              <w:numPr>
+                <w:ilvl w:val="0"/>
+                <w:numId w:val="2"/>
+              </w:numPr>
+            </w:pPr>
+            <w:r>
+              <w:rPr>
+                <w:rFonts w:ascii="Arial" w:cs="Arial" w:eastAsia="Arial" w:hAnsi="Arial"/>
+                <w:sz w:val="20"/>
+                <w:szCs w:val="20"/>
+              </w:rPr>
+              <w:t xml:space="preserve">Les autres pages ne sont plus accessibles sans me reconnecter.</w:t>
             </w:r>
           </w:p>
         </w:tc>

</xml_diff>